<commit_message>
feat: Sprint 4 — QR codes, A4 zone labels, print styles, ZPL behind Advanced toggle
</commit_message>
<xml_diff>
--- a/Warehouse Wizard Proposal.docx
+++ b/Warehouse Wizard Proposal.docx
@@ -29,9 +29,13 @@
       <w:pPr>
         <w:spacing w:before="0" w:after="480"/>
         <w:jc w:val="center"/>
-      </w:pPr>
-      <w:r>
-        <w:t>Prepared for: Mattew Hunte | Prepared by: Russell Hunte | May 2026</w:t>
+        <w:rPr>
+          <w:kern w:val="2"/>
+          <w14:ligatures w14:val="standardContextual"/>
+        </w:rPr>
+      </w:pPr>
+      <w:r>
+        <w:t>Prepared for: Matthew Hunte | Prepared by: Russell Hunte | May 2026</w:t>
       </w:r>
     </w:p>
     <w:p>
@@ -198,7 +202,7 @@
           <w:b/>
           <w:bCs/>
         </w:rPr>
-        <w:t>USD $1,500 per month</w:t>
+        <w:t>USD $750 per month</w:t>
       </w:r>
       <w:r>
         <w:t xml:space="preserve"> with a </w:t>
@@ -345,6 +349,12 @@
       <w:bookmarkEnd w:id="2"/>
     </w:p>
     <w:p>
+      <w:pPr>
+        <w:rPr>
+          <w:kern w:val="2"/>
+          <w14:ligatures w14:val="standardContextual"/>
+        </w:rPr>
+      </w:pPr>
       <w:r>
         <w:t xml:space="preserve">Warehouse Wizard provides a </w:t>
       </w:r>
@@ -356,7 +366,7 @@
         <w:t>structured, cloud-hosted warehouse management system</w:t>
       </w:r>
       <w:r>
-        <w:t xml:space="preserve"> built around your physical warehouse layout. The system transforms warehouse operations by providing:</w:t>
+        <w:t xml:space="preserve"> built around your physical warehouse layout. The system supports day-to-day warehouse operations by providing:</w:t>
       </w:r>
     </w:p>
     <w:p>
@@ -368,31 +378,25 @@
       </w:r>
     </w:p>
     <w:p>
-      <w:pPr>
+      <w:r>
+        <w:t>The system represents your warehouse structure including zones, aisles, racks, bays, levels, and depth positions. Storage locations are mapped and tracked, helping staff locate products faster and make better use of available space.</w:t>
+      </w:r>
+      <w:r>
+        <w:br/>
+      </w:r>
+      <w:r>
+        <w:br/>
+      </w:r>
+      <w:r>
         <w:rPr>
           <w:kern w:val="2"/>
           <w14:ligatures w14:val="standardContextual"/>
         </w:rPr>
-      </w:pPr>
-      <w:r>
-        <w:t>The system represents your warehouse structure including zones, aisles, racks, bays, levels, and depth positions. Storage locations are mapped and tracked, helping staff locate products faster and make better use of available space.</w:t>
-      </w:r>
-      <w:r>
-        <w:br/>
-      </w:r>
-      <w:r>
-        <w:br/>
-      </w:r>
-      <w:r>
-        <w:rPr>
-          <w:kern w:val="2"/>
-          <w14:ligatures w14:val="standardContextual"/>
-        </w:rPr>
         <w:drawing>
-          <wp:inline distT="0" distB="0" distL="0" distR="0" wp14:anchorId="323DD5E9" wp14:editId="1246E0A2">
-            <wp:extent cx="5731510" cy="2693035"/>
+          <wp:inline distT="0" distB="0" distL="0" distR="0" wp14:anchorId="1111D04B" wp14:editId="002B6378">
+            <wp:extent cx="5731510" cy="3298825"/>
             <wp:effectExtent l="0" t="0" r="2540" b="0"/>
-            <wp:docPr id="81677029" name="Picture 1"/>
+            <wp:docPr id="2005409309" name="Picture 1"/>
             <wp:cNvGraphicFramePr>
               <a:graphicFrameLocks xmlns:a="http://schemas.openxmlformats.org/drawingml/2006/main" noChangeAspect="1"/>
             </wp:cNvGraphicFramePr>
@@ -400,7 +404,7 @@
               <a:graphicData uri="http://schemas.openxmlformats.org/drawingml/2006/picture">
                 <pic:pic xmlns:pic="http://schemas.openxmlformats.org/drawingml/2006/picture">
                   <pic:nvPicPr>
-                    <pic:cNvPr id="81677029" name=""/>
+                    <pic:cNvPr id="2005409309" name=""/>
                     <pic:cNvPicPr/>
                   </pic:nvPicPr>
                   <pic:blipFill>
@@ -412,7 +416,7 @@
                   <pic:spPr>
                     <a:xfrm>
                       <a:off x="0" y="0"/>
-                      <a:ext cx="5731510" cy="2693035"/>
+                      <a:ext cx="5731510" cy="3298825"/>
                     </a:xfrm>
                     <a:prstGeom prst="rect">
                       <a:avLst/>
@@ -427,37 +431,28 @@
     </w:p>
     <w:p>
       <w:pPr>
-        <w:pStyle w:val="Heading2"/>
         <w:rPr>
           <w:kern w:val="2"/>
           <w14:ligatures w14:val="standardContextual"/>
         </w:rPr>
       </w:pPr>
-      <w:r>
-        <w:t>Guided Product Assignment</w:t>
-      </w:r>
-    </w:p>
-    <w:p>
-      <w:pPr>
+    </w:p>
+    <w:p>
+      <w:pPr>
+        <w:pStyle w:val="Heading2"/>
         <w:rPr>
           <w:kern w:val="2"/>
           <w14:ligatures w14:val="standardContextual"/>
         </w:rPr>
       </w:pPr>
       <w:r>
-        <w:t xml:space="preserve">Warehouse Wizard uses product characteristics (size, weight, category, storage requirements) and warehouse constraints (capacity, accessibility, safety) to suggest suitable </w:t>
-      </w:r>
-      <w:r>
         <w:lastRenderedPageBreak/>
-        <w:t>storage locations. This guided assignment can reduce handling time and improve warehouse organization.</w:t>
-      </w:r>
-    </w:p>
-    <w:p>
-      <w:pPr>
-        <w:pStyle w:val="Heading2"/>
-      </w:pPr>
-      <w:r>
-        <w:t>Operational Control &amp; Visibility</w:t>
+        <w:t>Guided Product Assignment</w:t>
+      </w:r>
+    </w:p>
+    <w:p>
+      <w:r>
+        <w:t>Warehouse Wizard uses product characteristics (size, weight, category, storage requirements) and warehouse constraints (capacity, accessibility, safety) to suggest suitable storage locations. This guided assignment can reduce handling time and improve warehouse organization.</w:t>
       </w:r>
     </w:p>
     <w:p>
@@ -467,6 +462,65 @@
           <w14:ligatures w14:val="standardContextual"/>
         </w:rPr>
       </w:pPr>
+      <w:r>
+        <w:rPr>
+          <w:kern w:val="2"/>
+          <w14:ligatures w14:val="standardContextual"/>
+        </w:rPr>
+        <w:drawing>
+          <wp:inline distT="0" distB="0" distL="0" distR="0" wp14:anchorId="67E0274F" wp14:editId="2A9E4AAE">
+            <wp:extent cx="5731510" cy="3362325"/>
+            <wp:effectExtent l="0" t="0" r="2540" b="9525"/>
+            <wp:docPr id="620833493" name="Picture 1"/>
+            <wp:cNvGraphicFramePr>
+              <a:graphicFrameLocks xmlns:a="http://schemas.openxmlformats.org/drawingml/2006/main" noChangeAspect="1"/>
+            </wp:cNvGraphicFramePr>
+            <a:graphic xmlns:a="http://schemas.openxmlformats.org/drawingml/2006/main">
+              <a:graphicData uri="http://schemas.openxmlformats.org/drawingml/2006/picture">
+                <pic:pic xmlns:pic="http://schemas.openxmlformats.org/drawingml/2006/picture">
+                  <pic:nvPicPr>
+                    <pic:cNvPr id="620833493" name=""/>
+                    <pic:cNvPicPr/>
+                  </pic:nvPicPr>
+                  <pic:blipFill>
+                    <a:blip r:embed="rId6"/>
+                    <a:stretch>
+                      <a:fillRect/>
+                    </a:stretch>
+                  </pic:blipFill>
+                  <pic:spPr>
+                    <a:xfrm>
+                      <a:off x="0" y="0"/>
+                      <a:ext cx="5731510" cy="3362325"/>
+                    </a:xfrm>
+                    <a:prstGeom prst="rect">
+                      <a:avLst/>
+                    </a:prstGeom>
+                  </pic:spPr>
+                </pic:pic>
+              </a:graphicData>
+            </a:graphic>
+          </wp:inline>
+        </w:drawing>
+      </w:r>
+    </w:p>
+    <w:p>
+      <w:pPr>
+        <w:rPr>
+          <w:kern w:val="2"/>
+          <w14:ligatures w14:val="standardContextual"/>
+        </w:rPr>
+      </w:pPr>
+    </w:p>
+    <w:p>
+      <w:pPr>
+        <w:pStyle w:val="Heading2"/>
+      </w:pPr>
+      <w:r>
+        <w:t>Operational Control &amp; Visibility</w:t>
+      </w:r>
+    </w:p>
+    <w:p>
       <w:bookmarkStart w:id="3" w:name="core-features"/>
       <w:r>
         <w:t>Tracking of receiving, movement, picking, and dispatch activities provides management with up-to-date visibility into warehouse operations. Actions can be recorded with user accountability, supporting an audit trail.</w:t>
@@ -474,9 +528,75 @@
     </w:p>
     <w:p>
       <w:pPr>
+        <w:rPr>
+          <w:kern w:val="2"/>
+          <w14:ligatures w14:val="standardContextual"/>
+        </w:rPr>
+      </w:pPr>
+      <w:r>
+        <w:rPr>
+          <w:kern w:val="2"/>
+          <w14:ligatures w14:val="standardContextual"/>
+        </w:rPr>
+        <w:drawing>
+          <wp:inline distT="0" distB="0" distL="0" distR="0" wp14:anchorId="143FF1C7" wp14:editId="43377BFA">
+            <wp:extent cx="5731510" cy="1994535"/>
+            <wp:effectExtent l="0" t="0" r="2540" b="5715"/>
+            <wp:docPr id="1986411904" name="Picture 1"/>
+            <wp:cNvGraphicFramePr>
+              <a:graphicFrameLocks xmlns:a="http://schemas.openxmlformats.org/drawingml/2006/main" noChangeAspect="1"/>
+            </wp:cNvGraphicFramePr>
+            <a:graphic xmlns:a="http://schemas.openxmlformats.org/drawingml/2006/main">
+              <a:graphicData uri="http://schemas.openxmlformats.org/drawingml/2006/picture">
+                <pic:pic xmlns:pic="http://schemas.openxmlformats.org/drawingml/2006/picture">
+                  <pic:nvPicPr>
+                    <pic:cNvPr id="1986411904" name=""/>
+                    <pic:cNvPicPr/>
+                  </pic:nvPicPr>
+                  <pic:blipFill>
+                    <a:blip r:embed="rId7"/>
+                    <a:stretch>
+                      <a:fillRect/>
+                    </a:stretch>
+                  </pic:blipFill>
+                  <pic:spPr>
+                    <a:xfrm>
+                      <a:off x="0" y="0"/>
+                      <a:ext cx="5731510" cy="1994535"/>
+                    </a:xfrm>
+                    <a:prstGeom prst="rect">
+                      <a:avLst/>
+                    </a:prstGeom>
+                  </pic:spPr>
+                </pic:pic>
+              </a:graphicData>
+            </a:graphic>
+          </wp:inline>
+        </w:drawing>
+      </w:r>
+    </w:p>
+    <w:p>
+      <w:pPr>
+        <w:rPr>
+          <w:kern w:val="2"/>
+          <w14:ligatures w14:val="standardContextual"/>
+        </w:rPr>
+      </w:pPr>
+    </w:p>
+    <w:p>
+      <w:pPr>
+        <w:rPr>
+          <w:kern w:val="2"/>
+          <w14:ligatures w14:val="standardContextual"/>
+        </w:rPr>
+      </w:pPr>
+    </w:p>
+    <w:p>
+      <w:pPr>
         <w:pStyle w:val="Heading1"/>
       </w:pPr>
       <w:r>
+        <w:lastRenderedPageBreak/>
         <w:t>4. Core Features &amp; Capabilities</w:t>
       </w:r>
       <w:bookmarkEnd w:id="3"/>
@@ -501,8 +621,8 @@
         <w:tblLook w:val="04A0" w:firstRow="1" w:lastRow="0" w:firstColumn="1" w:lastColumn="0" w:noHBand="0" w:noVBand="1"/>
       </w:tblPr>
       <w:tblGrid>
-        <w:gridCol w:w="3017"/>
-        <w:gridCol w:w="6009"/>
+        <w:gridCol w:w="3018"/>
+        <w:gridCol w:w="6008"/>
       </w:tblGrid>
       <w:tr>
         <w:trPr>
@@ -679,9 +799,13 @@
                 <w:ilvl w:val="0"/>
                 <w:numId w:val="2"/>
               </w:numPr>
+              <w:rPr>
+                <w:kern w:val="2"/>
+                <w14:ligatures w14:val="standardContextual"/>
+              </w:rPr>
             </w:pPr>
             <w:r>
-              <w:t>Comprehensive product master file with SKU, barcode, and specifications</w:t>
+              <w:t>Product master file with SKU, barcode, and specifications</w:t>
             </w:r>
           </w:p>
           <w:p>
@@ -691,9 +815,13 @@
                 <w:ilvl w:val="0"/>
                 <w:numId w:val="2"/>
               </w:numPr>
+              <w:rPr>
+                <w:kern w:val="2"/>
+                <w14:ligatures w14:val="standardContextual"/>
+              </w:rPr>
             </w:pPr>
             <w:r>
-              <w:t>Real-time stock search by product, location, supplier, or category</w:t>
+              <w:t>Up-to-date stock search by product, location, supplier, or category</w:t>
             </w:r>
           </w:p>
           <w:p>
@@ -703,9 +831,13 @@
                 <w:ilvl w:val="0"/>
                 <w:numId w:val="2"/>
               </w:numPr>
+              <w:rPr>
+                <w:kern w:val="2"/>
+                <w14:ligatures w14:val="standardContextual"/>
+              </w:rPr>
             </w:pPr>
             <w:r>
-              <w:t>Stock movement tracking with complete audit history</w:t>
+              <w:t>Stock movement tracking with an audit history</w:t>
             </w:r>
           </w:p>
           <w:p>
@@ -774,7 +906,7 @@
               </w:numPr>
             </w:pPr>
             <w:r>
-              <w:t>Pick list generation with optimized warehouse locations</w:t>
+              <w:t>Pick list generation with suggested warehouse locations</w:t>
             </w:r>
           </w:p>
           <w:p>
@@ -855,7 +987,6 @@
               </w:numPr>
             </w:pPr>
             <w:r>
-              <w:lastRenderedPageBreak/>
               <w:t>Warehouse utilization and space availability reports</w:t>
             </w:r>
           </w:p>
@@ -882,6 +1013,12 @@
             <w:r>
               <w:t>Slow-moving stock and low-stock alerts</w:t>
             </w:r>
+          </w:p>
+          <w:p>
+            <w:pPr>
+              <w:pStyle w:val="ListParagraph"/>
+              <w:ind w:left="720"/>
+            </w:pPr>
           </w:p>
         </w:tc>
       </w:tr>
@@ -1066,10 +1203,19 @@
           <w:p>
             <w:pPr>
               <w:jc w:val="center"/>
+              <w:rPr>
+                <w:kern w:val="2"/>
+                <w14:ligatures w14:val="standardContextual"/>
+              </w:rPr>
             </w:pPr>
             <w:r>
-              <w:t>$750</w:t>
+              <w:t>$450</w:t>
             </w:r>
+          </w:p>
+          <w:p>
+            <w:pPr>
+              <w:jc w:val="center"/>
+            </w:pPr>
           </w:p>
         </w:tc>
         <w:tc>
@@ -1087,7 +1233,10 @@
               <w:jc w:val="center"/>
             </w:pPr>
             <w:r>
-              <w:t>$3,500</w:t>
+              <w:t>$</w:t>
+            </w:r>
+            <w:r>
+              <w:t>7,100</w:t>
             </w:r>
           </w:p>
         </w:tc>
@@ -1146,6 +1295,10 @@
           <w:p>
             <w:pPr>
               <w:jc w:val="center"/>
+              <w:rPr>
+                <w:kern w:val="2"/>
+                <w14:ligatures w14:val="standardContextual"/>
+              </w:rPr>
             </w:pPr>
             <w:r>
               <w:rPr>
@@ -1153,8 +1306,13 @@
                 <w:bCs/>
                 <w:color w:val="4F81BD"/>
               </w:rPr>
-              <w:t>$1,500</w:t>
+              <w:t>$750</w:t>
             </w:r>
+          </w:p>
+          <w:p>
+            <w:pPr>
+              <w:jc w:val="center"/>
+            </w:pPr>
           </w:p>
         </w:tc>
         <w:tc>
@@ -1170,6 +1328,10 @@
           <w:p>
             <w:pPr>
               <w:jc w:val="center"/>
+              <w:rPr>
+                <w:kern w:val="2"/>
+                <w14:ligatures w14:val="standardContextual"/>
+              </w:rPr>
             </w:pPr>
             <w:r>
               <w:rPr>
@@ -1177,8 +1339,13 @@
                 <w:bCs/>
                 <w:color w:val="4F81BD"/>
               </w:rPr>
-              <w:t>$7,500</w:t>
+              <w:t>$8,900</w:t>
             </w:r>
+          </w:p>
+          <w:p>
+            <w:pPr>
+              <w:jc w:val="center"/>
+            </w:pPr>
           </w:p>
         </w:tc>
         <w:tc>
@@ -1416,7 +1583,6 @@
         </w:rPr>
       </w:pPr>
       <w:r>
-        <w:lastRenderedPageBreak/>
         <w:t xml:space="preserve">Our </w:t>
       </w:r>
       <w:r>
@@ -1469,6 +1635,7 @@
         </w:numPr>
       </w:pPr>
       <w:r>
+        <w:lastRenderedPageBreak/>
         <w:t>Confirm product categories and storage rules</w:t>
       </w:r>
     </w:p>
@@ -1758,32 +1925,32 @@
           <w:b/>
           <w:bCs/>
         </w:rPr>
+        <w:t>Structured implementation approach</w:t>
+      </w:r>
+      <w:r>
+        <w:t xml:space="preserve"> - Clear rollout process with training and support</w:t>
+      </w:r>
+    </w:p>
+    <w:p>
+      <w:pPr>
+        <w:pStyle w:val="Heading1"/>
+      </w:pPr>
+      <w:r>
+        <w:t>8. Next Steps</w:t>
+      </w:r>
+      <w:bookmarkEnd w:id="7"/>
+    </w:p>
+    <w:p>
+      <w:r>
+        <w:t>To move forward with the Warehouse Wizard implementation, I recommend the following approach:</w:t>
+      </w:r>
+    </w:p>
+    <w:p>
+      <w:pPr>
+        <w:pStyle w:val="Heading2"/>
+      </w:pPr>
+      <w:r>
         <w:lastRenderedPageBreak/>
-        <w:t>Structured implementation approach</w:t>
-      </w:r>
-      <w:r>
-        <w:t xml:space="preserve"> - Clear rollout process with training and support</w:t>
-      </w:r>
-    </w:p>
-    <w:p>
-      <w:pPr>
-        <w:pStyle w:val="Heading1"/>
-      </w:pPr>
-      <w:r>
-        <w:t>8. Next Steps</w:t>
-      </w:r>
-      <w:bookmarkEnd w:id="7"/>
-    </w:p>
-    <w:p>
-      <w:r>
-        <w:t>To move forward with the Warehouse Wizard implementation, I recommend the following approach:</w:t>
-      </w:r>
-    </w:p>
-    <w:p>
-      <w:pPr>
-        <w:pStyle w:val="Heading2"/>
-      </w:pPr>
-      <w:r>
         <w:t>Immediate Actions</w:t>
       </w:r>
     </w:p>
@@ -1794,6 +1961,10 @@
           <w:ilvl w:val="0"/>
           <w:numId w:val="3"/>
         </w:numPr>
+        <w:rPr>
+          <w:kern w:val="2"/>
+          <w14:ligatures w14:val="standardContextual"/>
+        </w:rPr>
       </w:pPr>
       <w:r>
         <w:rPr>
@@ -1853,6 +2024,12 @@
       </w:r>
     </w:p>
     <w:p>
+      <w:pPr>
+        <w:rPr>
+          <w:kern w:val="2"/>
+          <w14:ligatures w14:val="standardContextual"/>
+        </w:rPr>
+      </w:pPr>
       <w:r>
         <w:t xml:space="preserve">Professional WMS Package: </w:t>
       </w:r>
@@ -1861,10 +2038,16 @@
           <w:b/>
           <w:bCs/>
         </w:rPr>
-        <w:t>USD $1,500 per month</w:t>
-      </w:r>
-    </w:p>
-    <w:p>
+        <w:t>USD $750 per month</w:t>
+      </w:r>
+    </w:p>
+    <w:p>
+      <w:pPr>
+        <w:rPr>
+          <w:kern w:val="2"/>
+          <w14:ligatures w14:val="standardContextual"/>
+        </w:rPr>
+      </w:pPr>
       <w:r>
         <w:t xml:space="preserve">Implementation and setup: </w:t>
       </w:r>
@@ -1873,7 +2056,7 @@
           <w:b/>
           <w:bCs/>
         </w:rPr>
-        <w:t>USD $7,500</w:t>
+        <w:t>USD $8,900</w:t>
       </w:r>
     </w:p>
     <w:p>
@@ -1909,10 +2092,7 @@
         </w:rPr>
       </w:pPr>
       <w:r>
-        <w:t xml:space="preserve">Commercial </w:t>
-      </w:r>
-      <w:r>
-        <w:t>Terms</w:t>
+        <w:t>Commercial Terms (Refunds, Support &amp; Non-Payment)</w:t>
       </w:r>
     </w:p>
     <w:p>
@@ -1948,7 +2128,7 @@
         <w:t>Refund policy:</w:t>
       </w:r>
       <w:r>
-        <w:t xml:space="preserve"> Fees paid are non-refundable. This includes circumstances where the project is paused, deemed a “no-go,” or otherwise cannot proceed for any reason after the minimum 12-month term.</w:t>
+        <w:t xml:space="preserve"> All fees are non-refundable, including subscription fees and implementation/setup fees, regardless of usage, outcomes, or whether the project is paused or discontinued.</w:t>
       </w:r>
     </w:p>
     <w:p>
@@ -1959,7 +2139,23 @@
         </w:rPr>
       </w:pPr>
       <w:r>
-        <w:t>We are confident the system can work in your environment when configured and used as intended, and we will support you through implementation and adoption.</w:t>
+        <w:rPr>
+          <w:b/>
+          <w:bCs/>
+        </w:rPr>
+        <w:t>Stabilization support:</w:t>
+      </w:r>
+      <w:r>
+        <w:t xml:space="preserve"> If issues arise after go-live that prevent normal use of agreed core functions, we will continue working with your team to stabilize the system (configuration adjustments, troubleshooting, and defect fixes where applicable) until it is operating in a stable manner, assuming the system is used as intended and required dependencies (connectivity, devices, and accurate data) are in place.</w:t>
+      </w:r>
+      <w:r>
+        <w:t xml:space="preserve"> </w:t>
+      </w:r>
+      <w:r>
+        <w:t xml:space="preserve">Client is responsible for supplying IT Endpoints to </w:t>
+      </w:r>
+      <w:r>
+        <w:t xml:space="preserve">users of the System. </w:t>
       </w:r>
     </w:p>
     <w:p>
@@ -1977,7 +2173,7 @@
         <w:t>Non-payment:</w:t>
       </w:r>
       <w:r>
-        <w:t xml:space="preserve"> If payment is not received within 30 days of the due date, the system will be placed into a frozen state and will not allow normal operation until the outstanding balance is paid.</w:t>
+        <w:t xml:space="preserve"> Invoices are due as agreed. If payment is not received within 30 days of the due date, we may suspend service by placing the system into a frozen state that prevents normal operation until the outstanding balance is paid. We will provide notice before suspension.</w:t>
       </w:r>
     </w:p>
     <w:p>
@@ -2008,6 +2204,9 @@
     <w:p>
       <w:r>
         <w:t>Warehouse Wizard Implementation Specialist</w:t>
+      </w:r>
+      <w:r>
+        <w:t xml:space="preserve"> and Developer</w:t>
       </w:r>
     </w:p>
     <w:sectPr>
@@ -2172,6 +2371,268 @@
     </w:lvl>
   </w:abstractNum>
   <w:abstractNum w:abstractNumId="1" w15:restartNumberingAfterBreak="0">
+    <w:nsid w:val="14A36847"/>
+    <w:multiLevelType w:val="multilevel"/>
+    <w:tmpl w:val="80F229C6"/>
+    <w:lvl w:ilvl="0">
+      <w:start w:val="1"/>
+      <w:numFmt w:val="bullet"/>
+      <w:lvlText w:val=""/>
+      <w:lvlJc w:val="left"/>
+      <w:pPr>
+        <w:tabs>
+          <w:tab w:val="num" w:pos="720"/>
+        </w:tabs>
+        <w:ind w:left="720" w:hanging="360"/>
+      </w:pPr>
+      <w:rPr>
+        <w:rFonts w:ascii="Symbol" w:hAnsi="Symbol" w:hint="default"/>
+        <w:sz w:val="20"/>
+      </w:rPr>
+    </w:lvl>
+    <w:lvl w:ilvl="1" w:tentative="1">
+      <w:start w:val="1"/>
+      <w:numFmt w:val="bullet"/>
+      <w:lvlText w:val="o"/>
+      <w:lvlJc w:val="left"/>
+      <w:pPr>
+        <w:tabs>
+          <w:tab w:val="num" w:pos="1440"/>
+        </w:tabs>
+        <w:ind w:left="1440" w:hanging="360"/>
+      </w:pPr>
+      <w:rPr>
+        <w:rFonts w:ascii="Courier New" w:hAnsi="Courier New" w:hint="default"/>
+        <w:sz w:val="20"/>
+      </w:rPr>
+    </w:lvl>
+    <w:lvl w:ilvl="2" w:tentative="1">
+      <w:start w:val="1"/>
+      <w:numFmt w:val="bullet"/>
+      <w:lvlText w:val=""/>
+      <w:lvlJc w:val="left"/>
+      <w:pPr>
+        <w:tabs>
+          <w:tab w:val="num" w:pos="2160"/>
+        </w:tabs>
+        <w:ind w:left="2160" w:hanging="360"/>
+      </w:pPr>
+      <w:rPr>
+        <w:rFonts w:ascii="Wingdings" w:hAnsi="Wingdings" w:hint="default"/>
+        <w:sz w:val="20"/>
+      </w:rPr>
+    </w:lvl>
+    <w:lvl w:ilvl="3" w:tentative="1">
+      <w:start w:val="1"/>
+      <w:numFmt w:val="bullet"/>
+      <w:lvlText w:val=""/>
+      <w:lvlJc w:val="left"/>
+      <w:pPr>
+        <w:tabs>
+          <w:tab w:val="num" w:pos="2880"/>
+        </w:tabs>
+        <w:ind w:left="2880" w:hanging="360"/>
+      </w:pPr>
+      <w:rPr>
+        <w:rFonts w:ascii="Wingdings" w:hAnsi="Wingdings" w:hint="default"/>
+        <w:sz w:val="20"/>
+      </w:rPr>
+    </w:lvl>
+    <w:lvl w:ilvl="4" w:tentative="1">
+      <w:start w:val="1"/>
+      <w:numFmt w:val="bullet"/>
+      <w:lvlText w:val=""/>
+      <w:lvlJc w:val="left"/>
+      <w:pPr>
+        <w:tabs>
+          <w:tab w:val="num" w:pos="3600"/>
+        </w:tabs>
+        <w:ind w:left="3600" w:hanging="360"/>
+      </w:pPr>
+      <w:rPr>
+        <w:rFonts w:ascii="Wingdings" w:hAnsi="Wingdings" w:hint="default"/>
+        <w:sz w:val="20"/>
+      </w:rPr>
+    </w:lvl>
+    <w:lvl w:ilvl="5" w:tentative="1">
+      <w:start w:val="1"/>
+      <w:numFmt w:val="bullet"/>
+      <w:lvlText w:val=""/>
+      <w:lvlJc w:val="left"/>
+      <w:pPr>
+        <w:tabs>
+          <w:tab w:val="num" w:pos="4320"/>
+        </w:tabs>
+        <w:ind w:left="4320" w:hanging="360"/>
+      </w:pPr>
+      <w:rPr>
+        <w:rFonts w:ascii="Wingdings" w:hAnsi="Wingdings" w:hint="default"/>
+        <w:sz w:val="20"/>
+      </w:rPr>
+    </w:lvl>
+    <w:lvl w:ilvl="6" w:tentative="1">
+      <w:start w:val="1"/>
+      <w:numFmt w:val="bullet"/>
+      <w:lvlText w:val=""/>
+      <w:lvlJc w:val="left"/>
+      <w:pPr>
+        <w:tabs>
+          <w:tab w:val="num" w:pos="5040"/>
+        </w:tabs>
+        <w:ind w:left="5040" w:hanging="360"/>
+      </w:pPr>
+      <w:rPr>
+        <w:rFonts w:ascii="Wingdings" w:hAnsi="Wingdings" w:hint="default"/>
+        <w:sz w:val="20"/>
+      </w:rPr>
+    </w:lvl>
+    <w:lvl w:ilvl="7" w:tentative="1">
+      <w:start w:val="1"/>
+      <w:numFmt w:val="bullet"/>
+      <w:lvlText w:val=""/>
+      <w:lvlJc w:val="left"/>
+      <w:pPr>
+        <w:tabs>
+          <w:tab w:val="num" w:pos="5760"/>
+        </w:tabs>
+        <w:ind w:left="5760" w:hanging="360"/>
+      </w:pPr>
+      <w:rPr>
+        <w:rFonts w:ascii="Wingdings" w:hAnsi="Wingdings" w:hint="default"/>
+        <w:sz w:val="20"/>
+      </w:rPr>
+    </w:lvl>
+    <w:lvl w:ilvl="8" w:tentative="1">
+      <w:start w:val="1"/>
+      <w:numFmt w:val="bullet"/>
+      <w:lvlText w:val=""/>
+      <w:lvlJc w:val="left"/>
+      <w:pPr>
+        <w:tabs>
+          <w:tab w:val="num" w:pos="6480"/>
+        </w:tabs>
+        <w:ind w:left="6480" w:hanging="360"/>
+      </w:pPr>
+      <w:rPr>
+        <w:rFonts w:ascii="Wingdings" w:hAnsi="Wingdings" w:hint="default"/>
+        <w:sz w:val="20"/>
+      </w:rPr>
+    </w:lvl>
+  </w:abstractNum>
+  <w:abstractNum w:abstractNumId="2" w15:restartNumberingAfterBreak="0">
+    <w:nsid w:val="15785A24"/>
+    <w:multiLevelType w:val="multilevel"/>
+    <w:tmpl w:val="DAAA3CBC"/>
+    <w:lvl w:ilvl="0">
+      <w:start w:val="1"/>
+      <w:numFmt w:val="decimal"/>
+      <w:lvlText w:val="%1."/>
+      <w:lvlJc w:val="left"/>
+      <w:pPr>
+        <w:tabs>
+          <w:tab w:val="num" w:pos="720"/>
+        </w:tabs>
+        <w:ind w:left="720" w:hanging="360"/>
+      </w:pPr>
+    </w:lvl>
+    <w:lvl w:ilvl="1" w:tentative="1">
+      <w:start w:val="1"/>
+      <w:numFmt w:val="decimal"/>
+      <w:lvlText w:val="%2."/>
+      <w:lvlJc w:val="left"/>
+      <w:pPr>
+        <w:tabs>
+          <w:tab w:val="num" w:pos="1440"/>
+        </w:tabs>
+        <w:ind w:left="1440" w:hanging="360"/>
+      </w:pPr>
+    </w:lvl>
+    <w:lvl w:ilvl="2" w:tentative="1">
+      <w:start w:val="1"/>
+      <w:numFmt w:val="decimal"/>
+      <w:lvlText w:val="%3."/>
+      <w:lvlJc w:val="left"/>
+      <w:pPr>
+        <w:tabs>
+          <w:tab w:val="num" w:pos="2160"/>
+        </w:tabs>
+        <w:ind w:left="2160" w:hanging="360"/>
+      </w:pPr>
+    </w:lvl>
+    <w:lvl w:ilvl="3" w:tentative="1">
+      <w:start w:val="1"/>
+      <w:numFmt w:val="decimal"/>
+      <w:lvlText w:val="%4."/>
+      <w:lvlJc w:val="left"/>
+      <w:pPr>
+        <w:tabs>
+          <w:tab w:val="num" w:pos="2880"/>
+        </w:tabs>
+        <w:ind w:left="2880" w:hanging="360"/>
+      </w:pPr>
+    </w:lvl>
+    <w:lvl w:ilvl="4" w:tentative="1">
+      <w:start w:val="1"/>
+      <w:numFmt w:val="decimal"/>
+      <w:lvlText w:val="%5."/>
+      <w:lvlJc w:val="left"/>
+      <w:pPr>
+        <w:tabs>
+          <w:tab w:val="num" w:pos="3600"/>
+        </w:tabs>
+        <w:ind w:left="3600" w:hanging="360"/>
+      </w:pPr>
+    </w:lvl>
+    <w:lvl w:ilvl="5" w:tentative="1">
+      <w:start w:val="1"/>
+      <w:numFmt w:val="decimal"/>
+      <w:lvlText w:val="%6."/>
+      <w:lvlJc w:val="left"/>
+      <w:pPr>
+        <w:tabs>
+          <w:tab w:val="num" w:pos="4320"/>
+        </w:tabs>
+        <w:ind w:left="4320" w:hanging="360"/>
+      </w:pPr>
+    </w:lvl>
+    <w:lvl w:ilvl="6" w:tentative="1">
+      <w:start w:val="1"/>
+      <w:numFmt w:val="decimal"/>
+      <w:lvlText w:val="%7."/>
+      <w:lvlJc w:val="left"/>
+      <w:pPr>
+        <w:tabs>
+          <w:tab w:val="num" w:pos="5040"/>
+        </w:tabs>
+        <w:ind w:left="5040" w:hanging="360"/>
+      </w:pPr>
+    </w:lvl>
+    <w:lvl w:ilvl="7" w:tentative="1">
+      <w:start w:val="1"/>
+      <w:numFmt w:val="decimal"/>
+      <w:lvlText w:val="%8."/>
+      <w:lvlJc w:val="left"/>
+      <w:pPr>
+        <w:tabs>
+          <w:tab w:val="num" w:pos="5760"/>
+        </w:tabs>
+        <w:ind w:left="5760" w:hanging="360"/>
+      </w:pPr>
+    </w:lvl>
+    <w:lvl w:ilvl="8" w:tentative="1">
+      <w:start w:val="1"/>
+      <w:numFmt w:val="decimal"/>
+      <w:lvlText w:val="%9."/>
+      <w:lvlJc w:val="left"/>
+      <w:pPr>
+        <w:tabs>
+          <w:tab w:val="num" w:pos="6480"/>
+        </w:tabs>
+        <w:ind w:left="6480" w:hanging="360"/>
+      </w:pPr>
+    </w:lvl>
+  </w:abstractNum>
+  <w:abstractNum w:abstractNumId="3" w15:restartNumberingAfterBreak="0">
     <w:nsid w:val="1C2E3CED"/>
     <w:multiLevelType w:val="multilevel"/>
     <w:tmpl w:val="1FBE26D8"/>
@@ -2320,7 +2781,7 @@
       </w:rPr>
     </w:lvl>
   </w:abstractNum>
-  <w:abstractNum w:abstractNumId="2" w15:restartNumberingAfterBreak="0">
+  <w:abstractNum w:abstractNumId="4" w15:restartNumberingAfterBreak="0">
     <w:nsid w:val="2C2F427B"/>
     <w:multiLevelType w:val="hybridMultilevel"/>
     <w:tmpl w:val="3D0097D2"/>
@@ -2374,7 +2835,7 @@
       <w:lvlJc w:val="left"/>
     </w:lvl>
   </w:abstractNum>
-  <w:abstractNum w:abstractNumId="3" w15:restartNumberingAfterBreak="0">
+  <w:abstractNum w:abstractNumId="5" w15:restartNumberingAfterBreak="0">
     <w:nsid w:val="34572758"/>
     <w:multiLevelType w:val="hybridMultilevel"/>
     <w:tmpl w:val="23666222"/>
@@ -2460,7 +2921,156 @@
       </w:pPr>
     </w:lvl>
   </w:abstractNum>
-  <w:abstractNum w:abstractNumId="4" w15:restartNumberingAfterBreak="0">
+  <w:abstractNum w:abstractNumId="6" w15:restartNumberingAfterBreak="0">
+    <w:nsid w:val="3B8E6C14"/>
+    <w:multiLevelType w:val="multilevel"/>
+    <w:tmpl w:val="2E7E152A"/>
+    <w:lvl w:ilvl="0">
+      <w:start w:val="1"/>
+      <w:numFmt w:val="bullet"/>
+      <w:lvlText w:val=""/>
+      <w:lvlJc w:val="left"/>
+      <w:pPr>
+        <w:tabs>
+          <w:tab w:val="num" w:pos="720"/>
+        </w:tabs>
+        <w:ind w:left="720" w:hanging="360"/>
+      </w:pPr>
+      <w:rPr>
+        <w:rFonts w:ascii="Symbol" w:hAnsi="Symbol" w:hint="default"/>
+        <w:sz w:val="20"/>
+      </w:rPr>
+    </w:lvl>
+    <w:lvl w:ilvl="1" w:tentative="1">
+      <w:start w:val="1"/>
+      <w:numFmt w:val="bullet"/>
+      <w:lvlText w:val="o"/>
+      <w:lvlJc w:val="left"/>
+      <w:pPr>
+        <w:tabs>
+          <w:tab w:val="num" w:pos="1440"/>
+        </w:tabs>
+        <w:ind w:left="1440" w:hanging="360"/>
+      </w:pPr>
+      <w:rPr>
+        <w:rFonts w:ascii="Courier New" w:hAnsi="Courier New" w:hint="default"/>
+        <w:sz w:val="20"/>
+      </w:rPr>
+    </w:lvl>
+    <w:lvl w:ilvl="2" w:tentative="1">
+      <w:start w:val="1"/>
+      <w:numFmt w:val="bullet"/>
+      <w:lvlText w:val=""/>
+      <w:lvlJc w:val="left"/>
+      <w:pPr>
+        <w:tabs>
+          <w:tab w:val="num" w:pos="2160"/>
+        </w:tabs>
+        <w:ind w:left="2160" w:hanging="360"/>
+      </w:pPr>
+      <w:rPr>
+        <w:rFonts w:ascii="Wingdings" w:hAnsi="Wingdings" w:hint="default"/>
+        <w:sz w:val="20"/>
+      </w:rPr>
+    </w:lvl>
+    <w:lvl w:ilvl="3" w:tentative="1">
+      <w:start w:val="1"/>
+      <w:numFmt w:val="bullet"/>
+      <w:lvlText w:val=""/>
+      <w:lvlJc w:val="left"/>
+      <w:pPr>
+        <w:tabs>
+          <w:tab w:val="num" w:pos="2880"/>
+        </w:tabs>
+        <w:ind w:left="2880" w:hanging="360"/>
+      </w:pPr>
+      <w:rPr>
+        <w:rFonts w:ascii="Wingdings" w:hAnsi="Wingdings" w:hint="default"/>
+        <w:sz w:val="20"/>
+      </w:rPr>
+    </w:lvl>
+    <w:lvl w:ilvl="4" w:tentative="1">
+      <w:start w:val="1"/>
+      <w:numFmt w:val="bullet"/>
+      <w:lvlText w:val=""/>
+      <w:lvlJc w:val="left"/>
+      <w:pPr>
+        <w:tabs>
+          <w:tab w:val="num" w:pos="3600"/>
+        </w:tabs>
+        <w:ind w:left="3600" w:hanging="360"/>
+      </w:pPr>
+      <w:rPr>
+        <w:rFonts w:ascii="Wingdings" w:hAnsi="Wingdings" w:hint="default"/>
+        <w:sz w:val="20"/>
+      </w:rPr>
+    </w:lvl>
+    <w:lvl w:ilvl="5" w:tentative="1">
+      <w:start w:val="1"/>
+      <w:numFmt w:val="bullet"/>
+      <w:lvlText w:val=""/>
+      <w:lvlJc w:val="left"/>
+      <w:pPr>
+        <w:tabs>
+          <w:tab w:val="num" w:pos="4320"/>
+        </w:tabs>
+        <w:ind w:left="4320" w:hanging="360"/>
+      </w:pPr>
+      <w:rPr>
+        <w:rFonts w:ascii="Wingdings" w:hAnsi="Wingdings" w:hint="default"/>
+        <w:sz w:val="20"/>
+      </w:rPr>
+    </w:lvl>
+    <w:lvl w:ilvl="6" w:tentative="1">
+      <w:start w:val="1"/>
+      <w:numFmt w:val="bullet"/>
+      <w:lvlText w:val=""/>
+      <w:lvlJc w:val="left"/>
+      <w:pPr>
+        <w:tabs>
+          <w:tab w:val="num" w:pos="5040"/>
+        </w:tabs>
+        <w:ind w:left="5040" w:hanging="360"/>
+      </w:pPr>
+      <w:rPr>
+        <w:rFonts w:ascii="Wingdings" w:hAnsi="Wingdings" w:hint="default"/>
+        <w:sz w:val="20"/>
+      </w:rPr>
+    </w:lvl>
+    <w:lvl w:ilvl="7" w:tentative="1">
+      <w:start w:val="1"/>
+      <w:numFmt w:val="bullet"/>
+      <w:lvlText w:val=""/>
+      <w:lvlJc w:val="left"/>
+      <w:pPr>
+        <w:tabs>
+          <w:tab w:val="num" w:pos="5760"/>
+        </w:tabs>
+        <w:ind w:left="5760" w:hanging="360"/>
+      </w:pPr>
+      <w:rPr>
+        <w:rFonts w:ascii="Wingdings" w:hAnsi="Wingdings" w:hint="default"/>
+        <w:sz w:val="20"/>
+      </w:rPr>
+    </w:lvl>
+    <w:lvl w:ilvl="8" w:tentative="1">
+      <w:start w:val="1"/>
+      <w:numFmt w:val="bullet"/>
+      <w:lvlText w:val=""/>
+      <w:lvlJc w:val="left"/>
+      <w:pPr>
+        <w:tabs>
+          <w:tab w:val="num" w:pos="6480"/>
+        </w:tabs>
+        <w:ind w:left="6480" w:hanging="360"/>
+      </w:pPr>
+      <w:rPr>
+        <w:rFonts w:ascii="Wingdings" w:hAnsi="Wingdings" w:hint="default"/>
+        <w:sz w:val="20"/>
+      </w:rPr>
+    </w:lvl>
+  </w:abstractNum>
+  <w:abstractNum w:abstractNumId="7" w15:restartNumberingAfterBreak="0">
     <w:nsid w:val="5BD421E2"/>
     <w:multiLevelType w:val="hybridMultilevel"/>
     <w:tmpl w:val="490813B0"/>
@@ -2514,7 +3124,305 @@
       <w:lvlJc w:val="left"/>
     </w:lvl>
   </w:abstractNum>
-  <w:abstractNum w:abstractNumId="5" w15:restartNumberingAfterBreak="0">
+  <w:abstractNum w:abstractNumId="8" w15:restartNumberingAfterBreak="0">
+    <w:nsid w:val="5D9449FC"/>
+    <w:multiLevelType w:val="multilevel"/>
+    <w:tmpl w:val="1B0E28E8"/>
+    <w:lvl w:ilvl="0">
+      <w:start w:val="1"/>
+      <w:numFmt w:val="bullet"/>
+      <w:lvlText w:val=""/>
+      <w:lvlJc w:val="left"/>
+      <w:pPr>
+        <w:tabs>
+          <w:tab w:val="num" w:pos="720"/>
+        </w:tabs>
+        <w:ind w:left="720" w:hanging="360"/>
+      </w:pPr>
+      <w:rPr>
+        <w:rFonts w:ascii="Symbol" w:hAnsi="Symbol" w:hint="default"/>
+        <w:sz w:val="20"/>
+      </w:rPr>
+    </w:lvl>
+    <w:lvl w:ilvl="1" w:tentative="1">
+      <w:start w:val="1"/>
+      <w:numFmt w:val="bullet"/>
+      <w:lvlText w:val="o"/>
+      <w:lvlJc w:val="left"/>
+      <w:pPr>
+        <w:tabs>
+          <w:tab w:val="num" w:pos="1440"/>
+        </w:tabs>
+        <w:ind w:left="1440" w:hanging="360"/>
+      </w:pPr>
+      <w:rPr>
+        <w:rFonts w:ascii="Courier New" w:hAnsi="Courier New" w:hint="default"/>
+        <w:sz w:val="20"/>
+      </w:rPr>
+    </w:lvl>
+    <w:lvl w:ilvl="2" w:tentative="1">
+      <w:start w:val="1"/>
+      <w:numFmt w:val="bullet"/>
+      <w:lvlText w:val=""/>
+      <w:lvlJc w:val="left"/>
+      <w:pPr>
+        <w:tabs>
+          <w:tab w:val="num" w:pos="2160"/>
+        </w:tabs>
+        <w:ind w:left="2160" w:hanging="360"/>
+      </w:pPr>
+      <w:rPr>
+        <w:rFonts w:ascii="Wingdings" w:hAnsi="Wingdings" w:hint="default"/>
+        <w:sz w:val="20"/>
+      </w:rPr>
+    </w:lvl>
+    <w:lvl w:ilvl="3" w:tentative="1">
+      <w:start w:val="1"/>
+      <w:numFmt w:val="bullet"/>
+      <w:lvlText w:val=""/>
+      <w:lvlJc w:val="left"/>
+      <w:pPr>
+        <w:tabs>
+          <w:tab w:val="num" w:pos="2880"/>
+        </w:tabs>
+        <w:ind w:left="2880" w:hanging="360"/>
+      </w:pPr>
+      <w:rPr>
+        <w:rFonts w:ascii="Wingdings" w:hAnsi="Wingdings" w:hint="default"/>
+        <w:sz w:val="20"/>
+      </w:rPr>
+    </w:lvl>
+    <w:lvl w:ilvl="4" w:tentative="1">
+      <w:start w:val="1"/>
+      <w:numFmt w:val="bullet"/>
+      <w:lvlText w:val=""/>
+      <w:lvlJc w:val="left"/>
+      <w:pPr>
+        <w:tabs>
+          <w:tab w:val="num" w:pos="3600"/>
+        </w:tabs>
+        <w:ind w:left="3600" w:hanging="360"/>
+      </w:pPr>
+      <w:rPr>
+        <w:rFonts w:ascii="Wingdings" w:hAnsi="Wingdings" w:hint="default"/>
+        <w:sz w:val="20"/>
+      </w:rPr>
+    </w:lvl>
+    <w:lvl w:ilvl="5" w:tentative="1">
+      <w:start w:val="1"/>
+      <w:numFmt w:val="bullet"/>
+      <w:lvlText w:val=""/>
+      <w:lvlJc w:val="left"/>
+      <w:pPr>
+        <w:tabs>
+          <w:tab w:val="num" w:pos="4320"/>
+        </w:tabs>
+        <w:ind w:left="4320" w:hanging="360"/>
+      </w:pPr>
+      <w:rPr>
+        <w:rFonts w:ascii="Wingdings" w:hAnsi="Wingdings" w:hint="default"/>
+        <w:sz w:val="20"/>
+      </w:rPr>
+    </w:lvl>
+    <w:lvl w:ilvl="6" w:tentative="1">
+      <w:start w:val="1"/>
+      <w:numFmt w:val="bullet"/>
+      <w:lvlText w:val=""/>
+      <w:lvlJc w:val="left"/>
+      <w:pPr>
+        <w:tabs>
+          <w:tab w:val="num" w:pos="5040"/>
+        </w:tabs>
+        <w:ind w:left="5040" w:hanging="360"/>
+      </w:pPr>
+      <w:rPr>
+        <w:rFonts w:ascii="Wingdings" w:hAnsi="Wingdings" w:hint="default"/>
+        <w:sz w:val="20"/>
+      </w:rPr>
+    </w:lvl>
+    <w:lvl w:ilvl="7" w:tentative="1">
+      <w:start w:val="1"/>
+      <w:numFmt w:val="bullet"/>
+      <w:lvlText w:val=""/>
+      <w:lvlJc w:val="left"/>
+      <w:pPr>
+        <w:tabs>
+          <w:tab w:val="num" w:pos="5760"/>
+        </w:tabs>
+        <w:ind w:left="5760" w:hanging="360"/>
+      </w:pPr>
+      <w:rPr>
+        <w:rFonts w:ascii="Wingdings" w:hAnsi="Wingdings" w:hint="default"/>
+        <w:sz w:val="20"/>
+      </w:rPr>
+    </w:lvl>
+    <w:lvl w:ilvl="8" w:tentative="1">
+      <w:start w:val="1"/>
+      <w:numFmt w:val="bullet"/>
+      <w:lvlText w:val=""/>
+      <w:lvlJc w:val="left"/>
+      <w:pPr>
+        <w:tabs>
+          <w:tab w:val="num" w:pos="6480"/>
+        </w:tabs>
+        <w:ind w:left="6480" w:hanging="360"/>
+      </w:pPr>
+      <w:rPr>
+        <w:rFonts w:ascii="Wingdings" w:hAnsi="Wingdings" w:hint="default"/>
+        <w:sz w:val="20"/>
+      </w:rPr>
+    </w:lvl>
+  </w:abstractNum>
+  <w:abstractNum w:abstractNumId="9" w15:restartNumberingAfterBreak="0">
+    <w:nsid w:val="750B0872"/>
+    <w:multiLevelType w:val="multilevel"/>
+    <w:tmpl w:val="683E6D8A"/>
+    <w:lvl w:ilvl="0">
+      <w:start w:val="1"/>
+      <w:numFmt w:val="bullet"/>
+      <w:lvlText w:val=""/>
+      <w:lvlJc w:val="left"/>
+      <w:pPr>
+        <w:tabs>
+          <w:tab w:val="num" w:pos="720"/>
+        </w:tabs>
+        <w:ind w:left="720" w:hanging="360"/>
+      </w:pPr>
+      <w:rPr>
+        <w:rFonts w:ascii="Symbol" w:hAnsi="Symbol" w:hint="default"/>
+        <w:sz w:val="20"/>
+      </w:rPr>
+    </w:lvl>
+    <w:lvl w:ilvl="1" w:tentative="1">
+      <w:start w:val="1"/>
+      <w:numFmt w:val="bullet"/>
+      <w:lvlText w:val="o"/>
+      <w:lvlJc w:val="left"/>
+      <w:pPr>
+        <w:tabs>
+          <w:tab w:val="num" w:pos="1440"/>
+        </w:tabs>
+        <w:ind w:left="1440" w:hanging="360"/>
+      </w:pPr>
+      <w:rPr>
+        <w:rFonts w:ascii="Courier New" w:hAnsi="Courier New" w:hint="default"/>
+        <w:sz w:val="20"/>
+      </w:rPr>
+    </w:lvl>
+    <w:lvl w:ilvl="2" w:tentative="1">
+      <w:start w:val="1"/>
+      <w:numFmt w:val="bullet"/>
+      <w:lvlText w:val=""/>
+      <w:lvlJc w:val="left"/>
+      <w:pPr>
+        <w:tabs>
+          <w:tab w:val="num" w:pos="2160"/>
+        </w:tabs>
+        <w:ind w:left="2160" w:hanging="360"/>
+      </w:pPr>
+      <w:rPr>
+        <w:rFonts w:ascii="Wingdings" w:hAnsi="Wingdings" w:hint="default"/>
+        <w:sz w:val="20"/>
+      </w:rPr>
+    </w:lvl>
+    <w:lvl w:ilvl="3" w:tentative="1">
+      <w:start w:val="1"/>
+      <w:numFmt w:val="bullet"/>
+      <w:lvlText w:val=""/>
+      <w:lvlJc w:val="left"/>
+      <w:pPr>
+        <w:tabs>
+          <w:tab w:val="num" w:pos="2880"/>
+        </w:tabs>
+        <w:ind w:left="2880" w:hanging="360"/>
+      </w:pPr>
+      <w:rPr>
+        <w:rFonts w:ascii="Wingdings" w:hAnsi="Wingdings" w:hint="default"/>
+        <w:sz w:val="20"/>
+      </w:rPr>
+    </w:lvl>
+    <w:lvl w:ilvl="4" w:tentative="1">
+      <w:start w:val="1"/>
+      <w:numFmt w:val="bullet"/>
+      <w:lvlText w:val=""/>
+      <w:lvlJc w:val="left"/>
+      <w:pPr>
+        <w:tabs>
+          <w:tab w:val="num" w:pos="3600"/>
+        </w:tabs>
+        <w:ind w:left="3600" w:hanging="360"/>
+      </w:pPr>
+      <w:rPr>
+        <w:rFonts w:ascii="Wingdings" w:hAnsi="Wingdings" w:hint="default"/>
+        <w:sz w:val="20"/>
+      </w:rPr>
+    </w:lvl>
+    <w:lvl w:ilvl="5" w:tentative="1">
+      <w:start w:val="1"/>
+      <w:numFmt w:val="bullet"/>
+      <w:lvlText w:val=""/>
+      <w:lvlJc w:val="left"/>
+      <w:pPr>
+        <w:tabs>
+          <w:tab w:val="num" w:pos="4320"/>
+        </w:tabs>
+        <w:ind w:left="4320" w:hanging="360"/>
+      </w:pPr>
+      <w:rPr>
+        <w:rFonts w:ascii="Wingdings" w:hAnsi="Wingdings" w:hint="default"/>
+        <w:sz w:val="20"/>
+      </w:rPr>
+    </w:lvl>
+    <w:lvl w:ilvl="6" w:tentative="1">
+      <w:start w:val="1"/>
+      <w:numFmt w:val="bullet"/>
+      <w:lvlText w:val=""/>
+      <w:lvlJc w:val="left"/>
+      <w:pPr>
+        <w:tabs>
+          <w:tab w:val="num" w:pos="5040"/>
+        </w:tabs>
+        <w:ind w:left="5040" w:hanging="360"/>
+      </w:pPr>
+      <w:rPr>
+        <w:rFonts w:ascii="Wingdings" w:hAnsi="Wingdings" w:hint="default"/>
+        <w:sz w:val="20"/>
+      </w:rPr>
+    </w:lvl>
+    <w:lvl w:ilvl="7" w:tentative="1">
+      <w:start w:val="1"/>
+      <w:numFmt w:val="bullet"/>
+      <w:lvlText w:val=""/>
+      <w:lvlJc w:val="left"/>
+      <w:pPr>
+        <w:tabs>
+          <w:tab w:val="num" w:pos="5760"/>
+        </w:tabs>
+        <w:ind w:left="5760" w:hanging="360"/>
+      </w:pPr>
+      <w:rPr>
+        <w:rFonts w:ascii="Wingdings" w:hAnsi="Wingdings" w:hint="default"/>
+        <w:sz w:val="20"/>
+      </w:rPr>
+    </w:lvl>
+    <w:lvl w:ilvl="8" w:tentative="1">
+      <w:start w:val="1"/>
+      <w:numFmt w:val="bullet"/>
+      <w:lvlText w:val=""/>
+      <w:lvlJc w:val="left"/>
+      <w:pPr>
+        <w:tabs>
+          <w:tab w:val="num" w:pos="6480"/>
+        </w:tabs>
+        <w:ind w:left="6480" w:hanging="360"/>
+      </w:pPr>
+      <w:rPr>
+        <w:rFonts w:ascii="Wingdings" w:hAnsi="Wingdings" w:hint="default"/>
+        <w:sz w:val="20"/>
+      </w:rPr>
+    </w:lvl>
+  </w:abstractNum>
+  <w:abstractNum w:abstractNumId="10" w15:restartNumberingAfterBreak="0">
     <w:nsid w:val="77AF50A6"/>
     <w:multiLevelType w:val="hybridMultilevel"/>
     <w:tmpl w:val="4D6488A2"/>
@@ -2569,25 +3477,25 @@
     </w:lvl>
   </w:abstractNum>
   <w:num w:numId="1" w16cid:durableId="192767608">
-    <w:abstractNumId w:val="3"/>
+    <w:abstractNumId w:val="5"/>
     <w:lvlOverride w:ilvl="0">
       <w:startOverride w:val="1"/>
     </w:lvlOverride>
   </w:num>
   <w:num w:numId="2" w16cid:durableId="549540537">
-    <w:abstractNumId w:val="5"/>
+    <w:abstractNumId w:val="10"/>
     <w:lvlOverride w:ilvl="0">
       <w:startOverride w:val="1"/>
     </w:lvlOverride>
   </w:num>
   <w:num w:numId="3" w16cid:durableId="1036274947">
-    <w:abstractNumId w:val="2"/>
+    <w:abstractNumId w:val="4"/>
     <w:lvlOverride w:ilvl="0">
       <w:startOverride w:val="1"/>
     </w:lvlOverride>
   </w:num>
   <w:num w:numId="4" w16cid:durableId="1285697868">
-    <w:abstractNumId w:val="4"/>
+    <w:abstractNumId w:val="7"/>
     <w:lvlOverride w:ilvl="0">
       <w:startOverride w:val="1"/>
     </w:lvlOverride>
@@ -2596,7 +3504,22 @@
     <w:abstractNumId w:val="0"/>
   </w:num>
   <w:num w:numId="6" w16cid:durableId="1290162013">
+    <w:abstractNumId w:val="3"/>
+  </w:num>
+  <w:num w:numId="7" w16cid:durableId="1520318941">
+    <w:abstractNumId w:val="8"/>
+  </w:num>
+  <w:num w:numId="8" w16cid:durableId="1845628618">
+    <w:abstractNumId w:val="9"/>
+  </w:num>
+  <w:num w:numId="9" w16cid:durableId="700474493">
+    <w:abstractNumId w:val="6"/>
+  </w:num>
+  <w:num w:numId="10" w16cid:durableId="1865558205">
     <w:abstractNumId w:val="1"/>
+  </w:num>
+  <w:num w:numId="11" w16cid:durableId="716440776">
+    <w:abstractNumId w:val="2"/>
   </w:num>
 </w:numbering>
 </file>

</xml_diff>